<commit_message>
Refresh downloadable author names and TPM kit text
</commit_message>
<xml_diff>
--- a/downloads/01_Product_Launch_Narrative_Answer_Evidence.docx
+++ b/downloads/01_Product_Launch_Narrative_Answer_Evidence.docx
@@ -30,7 +30,7 @@
           <w:color w:val="5A6670"/>
           <w:sz w:val="18"/>
         </w:rPr>
-        <w:t>Original application writing sample  |  Sharmila Rammohan</w:t>
+        <w:t>Original application writing sample  |  Sharmila Das</w:t>
       </w:r>
     </w:p>
     <w:p>
@@ -143,7 +143,7 @@
         <w:color w:val="5A6670"/>
         <w:sz w:val="16"/>
       </w:rPr>
-      <w:t>Sharmila Rammohan  •  Writing Sample</w:t>
+      <w:t>Sharmila Das  •  Writing Sample</w:t>
     </w:r>
   </w:p>
 </w:ftr>

</xml_diff>